<commit_message>
Update thesis: add high-res schematics, silicon layout diagram, and full two-sided text justification
</commit_message>
<xml_diff>
--- a/reports/OpAmp2Stage_Project_Thesis.docx
+++ b/reports/OpAmp2Stage_Project_Thesis.docx
@@ -117,16 +117,25 @@
       </w:r>
     </w:p>
     <w:p>
+      <w:pPr>
+        <w:jc w:val="both"/>
+      </w:pPr>
       <w:r>
         <w:t>This project thesis presents the complete design, transistor sizing, simulation verification, and physical layout of a high-performance two-stage CMOS operational amplifier designed exclusively in the Semiconductor Complex Limited (SCL) 1.2 µm CMOS technology (`scl_c1d`) using an entirely open-source electronic design automation (EDA) flow. The open-source flow encompasses Xschem for hierarchical schematic capture and netlisting, ngspice-45 for rigorous analog SPICE simulations, and KLayout/Magic for physical GDSII layout synthesis and design rule checking (DRC).</w:t>
       </w:r>
     </w:p>
     <w:p>
+      <w:pPr>
+        <w:jc w:val="both"/>
+      </w:pPr>
       <w:r>
         <w:t>The amplifier employs a PMOS differential input pair with an NMOS current-mirror active load in the first stage, followed by an NMOS common-source gain driver with a PMOS active current load in the second stage. Frequency compensation is achieved via a Miller capacitor combined in series with a nulling resistor configured to cancel the non-dominant output pole via Left-Half-Plane (LHP) zero placement. Hand calculations using BSIM3v3 device physics were conducted to overcome the severe channel-length modulation (low output resistance) exhibited by the SCL 1.2 µm devices at minimum channel length, necessitating non-minimum gate lengths of 3.0 µm to 5.0 µm.</w:t>
       </w:r>
     </w:p>
     <w:p>
+      <w:pPr>
+        <w:jc w:val="both"/>
+      </w:pPr>
       <w:r>
         <w:t>Extensive simulation results under nominal operating conditions (VDD = 5.0 V, VSS = 0 V, CL = 10 pF, T = 27°C) demonstrate an open-loop DC voltage gain of 70.33 dB (3284.7 V/V), a unity-gain bandwidth (GBW) of 10.20 MHz, a phase margin of 68.30° (63.70° in closed-loop buffer configuration), a positive slew rate of 8.90 V/µs, a negative slew rate of 11.76 V/µs, a DC CMRR of 72.40 dB, a DC PSRR+ of 99.93 dB, a DC PSRR- of 84.87 dB, and a linear output voltage swing of 0.28 V to 4.62 V. The total static power dissipation is exceptionally low at 1.564 mW (quiescent current 312.87 µA), beating the 10 mW budget by more than six-fold. Robustness is verified across 15 PVT corners spanning -40°C to +125°C across Slow, Nominal, and Fast device cards. A physical layout adhering to common-centroid and interdigitated matching was synthesized, achieving a total die footprint of 180 µm × 120 µm (0.0216 mm²). All design files, testbenches, automation scripts, and verification results have been structured and published to GitHub.</w:t>
       </w:r>
@@ -155,6 +164,7 @@
           <w:p>
             <w:pPr>
               <w:spacing w:before="80" w:after="80"/>
+              <w:jc w:val="both"/>
             </w:pPr>
             <w:r>
               <w:rPr>
@@ -175,7 +185,7 @@
     </w:tbl>
     <w:p>
       <w:pPr>
-        <w:spacing w:after="120"/>
+        <w:spacing w:after="80"/>
       </w:pPr>
     </w:p>
     <w:p>
@@ -200,11 +210,17 @@
       </w:r>
     </w:p>
     <w:p>
+      <w:pPr>
+        <w:jc w:val="both"/>
+      </w:pPr>
       <w:r>
         <w:t>Operational amplifiers (op-amps) constitute the foundational building block of analog and mixed-signal integrated circuits, serving ubiquitous roles in sensor interfaces, continuous-time and switched-capacitor filters, analog-to-digital converters (ADCs), and voltage regulators. Modern IC design often focuses on deep sub-micron nodes (e.g., 28 nm, 16 nm FinFETs); however, mature and legacy technology nodes such as 1.2 µm, 0.8 µm, and 0.35 µm remain critically important for automotive applications, power management, high-voltage analog sensing, and domestic semiconductor manufacturing initiatives in regions establishing sovereign foundry ecosystems, such as India's Semiconductor Complex Limited (SCL), Chandigarh.</w:t>
       </w:r>
     </w:p>
     <w:p>
+      <w:pPr>
+        <w:jc w:val="both"/>
+      </w:pPr>
       <w:r>
         <w:t>While mature nodes offer high supply voltage tolerance (5.0 V rail-to-rail operation) and favorable breakdown limits, designing high-gain, wide-bandwidth operational amplifiers in a 1.2 µm single-poly process presents severe analog design hurdles: moderate transconductance efficiency (gm/Id), significant channel-length modulation (low Early voltage), substantial parasitic overlap and junction capacitances, and the complete lack of modern thin-film MIM/PIP capacitor layers for integrated compensation. This project undertakes the end-to-end design, optimization, and validation of a robust two-stage CMOS op-amp tailored strictly for the SCL 1.2 µm process (`scl_c1d`).</w:t>
       </w:r>
@@ -218,6 +234,9 @@
       </w:r>
     </w:p>
     <w:p>
+      <w:pPr>
+        <w:jc w:val="both"/>
+      </w:pPr>
       <w:r>
         <w:t>Historically, custom analog IC design has been restricted to expensive proprietary EDA suites (e.g., Cadence Virtuoso, Synopsys Custom Compiler). Recent breakthroughs in open-source EDA tooling have enabled complete silicon-proven flows. In this work, the entire design and verification pipeline was executed using 100% open-source software:</w:t>
       </w:r>
@@ -225,10 +244,12 @@
     <w:p>
       <w:pPr>
         <w:pStyle w:val="ListBullet"/>
+        <w:jc w:val="both"/>
       </w:pPr>
       <w:r>
         <w:rPr>
           <w:b/>
+          <w:color w:val="003366"/>
         </w:rPr>
         <w:t xml:space="preserve">Xschem 3.4.8RC: </w:t>
       </w:r>
@@ -239,10 +260,12 @@
     <w:p>
       <w:pPr>
         <w:pStyle w:val="ListBullet"/>
+        <w:jc w:val="both"/>
       </w:pPr>
       <w:r>
         <w:rPr>
           <w:b/>
+          <w:color w:val="003366"/>
         </w:rPr>
         <w:t xml:space="preserve">ngspice-45.2: </w:t>
       </w:r>
@@ -253,10 +276,12 @@
     <w:p>
       <w:pPr>
         <w:pStyle w:val="ListBullet"/>
+        <w:jc w:val="both"/>
       </w:pPr>
       <w:r>
         <w:rPr>
           <w:b/>
+          <w:color w:val="003366"/>
         </w:rPr>
         <w:t xml:space="preserve">KLayout 0.30.0: </w:t>
       </w:r>
@@ -267,10 +292,12 @@
     <w:p>
       <w:pPr>
         <w:pStyle w:val="ListBullet"/>
+        <w:jc w:val="both"/>
       </w:pPr>
       <w:r>
         <w:rPr>
           <w:b/>
+          <w:color w:val="003366"/>
         </w:rPr>
         <w:t xml:space="preserve">Magic 8.3: </w:t>
       </w:r>
@@ -287,6 +314,9 @@
       </w:r>
     </w:p>
     <w:p>
+      <w:pPr>
+        <w:jc w:val="both"/>
+      </w:pPr>
       <w:r>
         <w:t>The project targets are established based on industry-standard general-purpose operational amplifier requirements driving a substantial capacitive load of 10 pF from a 5.0 V unipolar power supply. Table 1.1 delineates these initial target criteria.</w:t>
       </w:r>
@@ -1555,7 +1585,14 @@
       </w:tr>
     </w:tbl>
     <w:p>
+      <w:pPr>
+        <w:jc w:val="center"/>
+      </w:pPr>
       <w:r>
+        <w:rPr>
+          <w:i/>
+          <w:sz w:val="19"/>
+        </w:rPr>
         <w:t>Table 1.1: Project Target Specifications and Rationale.</w:t>
       </w:r>
     </w:p>
@@ -1581,11 +1618,17 @@
       </w:r>
     </w:p>
     <w:p>
+      <w:pPr>
+        <w:jc w:val="both"/>
+      </w:pPr>
       <w:r>
         <w:t>The SCL 1.2 µm CMOS process (`scl_c1d`) is a twin-tub, N-well silicon-gate process fabricated on a P-type substrate. The foundry models supplied in the open-source PDK distribution are BSIM3v3 models (SPICE Level 8 in ngspice, mapped from HSPICE Level 49). The transistor models are designated as `N` for NMOS and `P` for PMOS devices, configured for 5.0 V nominal operation with an oxide thickness tox of 23.6 nm (2.36 × 10⁻⁸ m).</w:t>
       </w:r>
     </w:p>
     <w:p>
+      <w:pPr>
+        <w:jc w:val="both"/>
+      </w:pPr>
       <w:r>
         <w:t>Key physical BSIM3v3 model parameters extracted from the nominal model files include:</w:t>
       </w:r>
@@ -1593,10 +1636,12 @@
     <w:p>
       <w:pPr>
         <w:pStyle w:val="ListBullet"/>
+        <w:jc w:val="both"/>
       </w:pPr>
       <w:r>
         <w:rPr>
           <w:b/>
+          <w:color w:val="003366"/>
         </w:rPr>
         <w:t xml:space="preserve">NMOS Threshold Voltage (Vth0): </w:t>
       </w:r>
@@ -1607,10 +1652,12 @@
     <w:p>
       <w:pPr>
         <w:pStyle w:val="ListBullet"/>
+        <w:jc w:val="both"/>
       </w:pPr>
       <w:r>
         <w:rPr>
           <w:b/>
+          <w:color w:val="003366"/>
         </w:rPr>
         <w:t xml:space="preserve">PMOS Threshold Voltage (Vth0): </w:t>
       </w:r>
@@ -1621,10 +1668,12 @@
     <w:p>
       <w:pPr>
         <w:pStyle w:val="ListBullet"/>
+        <w:jc w:val="both"/>
       </w:pPr>
       <w:r>
         <w:rPr>
           <w:b/>
+          <w:color w:val="003366"/>
         </w:rPr>
         <w:t xml:space="preserve">Specific Gate Oxide Capacitance (Cox): </w:t>
       </w:r>
@@ -1641,11 +1690,17 @@
       </w:r>
     </w:p>
     <w:p>
+      <w:pPr>
+        <w:jc w:val="both"/>
+      </w:pPr>
       <w:r>
         <w:t>During initial device characterization, DC parametric sweeps were conducted on minimum-geometry transistors (L = 1.2 µm). A critical finding emerged: at L = 1.2 µm, the PMOS transistor exhibits severe Drain-Induced Barrier Lowering (DIBL) and channel-length modulation (λ), resulting in an output conductance gds exceeding 125 µS at modest drain currents (~ 20 µA). The intrinsic single-transistor gain (gm/gds) collapsed to less than 8.5 V/V (18.6 dB). Attempting to build a two-stage op-amp using minimum-length transistors would yield an overall DC gain under 40 dB, drastically failing the 70 dB specification.</w:t>
       </w:r>
     </w:p>
     <w:p>
+      <w:pPr>
+        <w:jc w:val="both"/>
+      </w:pPr>
       <w:r>
         <w:t>To combat this physical constraint, analog channel lengths were aggressively scaled upward: the differential pair transistors were sized with L = 3.0 µm, while current mirror and active load transistors were sized with L = 4.0 µm and L = 5.0 µm. Increasing the gate length from 1.2 µm to 3.0–5.0 µm lowered gds from &gt; 120 µS down to 3.1 µS for PMOS and 0.77 µS for NMOS, restoring stage gains above 35 dB per stage and enabling over 70 dB total open-loop gain.</w:t>
       </w:r>
@@ -1659,6 +1714,9 @@
       </w:r>
     </w:p>
     <w:p>
+      <w:pPr>
+        <w:jc w:val="both"/>
+      </w:pPr>
       <w:r>
         <w:t>The SCL 1.2 µm PDK (`scl_c1d`) is strictly a Single-Poly, Double-Metal (1P2M) process. Unlike advanced analog nodes, this PDK does NOT feature a secondary polysilicon layer (Poly 2) or a dedicated thin-dielectric metal layer for Poly-Insulator-Poly (PIP) or Metal-Insulator-Metal (MIM) linear capacitors. Inspection of the foundry design rules and KLayout LVS decks revealed that the PDK defines only 10 legal physical devices: NMOS, PMOS, 5 resistor layers (diffusion, well, poly), and 3 junction diodes. There is no native capacitor extraction primitive. Consequently, on-chip compensation capacitors must be realized either via MOSFET gate inversion capacitance (with gate-to-source DC bias restrictions) or off-chip compensation, which is rigorously analyzed in Chapter 7.</w:t>
       </w:r>
@@ -1672,6 +1730,9 @@
       </w:r>
     </w:p>
     <w:p>
+      <w:pPr>
+        <w:jc w:val="both"/>
+      </w:pPr>
       <w:r>
         <w:t>The PDK incorporates discrete corner card libraries defining variations in carrier mobility, oxide thickness, and threshold voltages. Five physical corners are supported:</w:t>
       </w:r>
@@ -1679,8 +1740,13 @@
     <w:p>
       <w:pPr>
         <w:pStyle w:val="ListBullet"/>
+        <w:jc w:val="both"/>
       </w:pPr>
       <w:r>
+        <w:rPr>
+          <w:b/>
+          <w:color w:val="003366"/>
+        </w:rPr>
         <w:t xml:space="preserve">NOM (Typical-Typical, TT): </w:t>
       </w:r>
       <w:r>
@@ -1690,8 +1756,13 @@
     <w:p>
       <w:pPr>
         <w:pStyle w:val="ListBullet"/>
+        <w:jc w:val="both"/>
       </w:pPr>
       <w:r>
+        <w:rPr>
+          <w:b/>
+          <w:color w:val="003366"/>
+        </w:rPr>
         <w:t xml:space="preserve">SLOW (Slow-Slow, SS): </w:t>
       </w:r>
       <w:r>
@@ -1701,8 +1772,13 @@
     <w:p>
       <w:pPr>
         <w:pStyle w:val="ListBullet"/>
+        <w:jc w:val="both"/>
       </w:pPr>
       <w:r>
+        <w:rPr>
+          <w:b/>
+          <w:color w:val="003366"/>
+        </w:rPr>
         <w:t xml:space="preserve">FAST (Fast-Fast, FF): </w:t>
       </w:r>
       <w:r>
@@ -1712,8 +1788,13 @@
     <w:p>
       <w:pPr>
         <w:pStyle w:val="ListBullet"/>
+        <w:jc w:val="both"/>
       </w:pPr>
       <w:r>
+        <w:rPr>
+          <w:b/>
+          <w:color w:val="003366"/>
+        </w:rPr>
         <w:t xml:space="preserve">SLOWFAST (Slow NMOS, Fast PMOS, SF): </w:t>
       </w:r>
       <w:r>
@@ -1723,8 +1804,13 @@
     <w:p>
       <w:pPr>
         <w:pStyle w:val="ListBullet"/>
+        <w:jc w:val="both"/>
       </w:pPr>
       <w:r>
+        <w:rPr>
+          <w:b/>
+          <w:color w:val="003366"/>
+        </w:rPr>
         <w:t xml:space="preserve">FASTSLOW (Fast NMOS, Slow PMOS, FS): </w:t>
       </w:r>
       <w:r>
@@ -1753,8 +1839,11 @@
       </w:r>
     </w:p>
     <w:p>
+      <w:pPr>
+        <w:jc w:val="both"/>
+      </w:pPr>
       <w:r>
-        <w:t>A classical two-stage architecture was selected for its proven robustness, high gain, and wide output swing. Figure 3.1 illustrates the complete circuit schematic of the designed operational amplifier.</w:t>
+        <w:t>A classical two-stage architecture was selected for its proven robustness, high gain, and wide output swing. Figure 3.1 illustrates the complete circuit schematic of the designed operational amplifier with exact device names, transistor sizing, bias circuitry, and compensation components.</w:t>
       </w:r>
     </w:p>
     <w:p>
@@ -1766,7 +1855,7 @@
       <w:r>
         <w:drawing>
           <wp:inline xmlns:a="http://schemas.openxmlformats.org/drawingml/2006/main" xmlns:pic="http://schemas.openxmlformats.org/drawingml/2006/picture">
-            <wp:extent cx="5303520" cy="3712464"/>
+            <wp:extent cx="5669280" cy="4001845"/>
             <wp:docPr id="1" name="Picture 1"/>
             <wp:cNvGraphicFramePr>
               <a:graphicFrameLocks noChangeAspect="1"/>
@@ -1787,7 +1876,7 @@
                   <pic:spPr>
                     <a:xfrm>
                       <a:off x="0" y="0"/>
-                      <a:ext cx="5303520" cy="3712464"/>
+                      <a:ext cx="5669280" cy="4001845"/>
                     </a:xfrm>
                     <a:prstGeom prst="rect"/>
                   </pic:spPr>
@@ -1807,10 +1896,13 @@
           <w:i/>
           <w:sz w:val="19"/>
         </w:rPr>
-        <w:t>Figure 3.1: Complete Schematic of the SCL 1.2 µm Two-Stage CMOS Op-Amp in Xschem.</w:t>
+        <w:t>Figure 3.1: Detailed Circuit Schematic of the SCL 1.2 µm Two-Stage CMOS Operational Amplifier.</w:t>
       </w:r>
     </w:p>
     <w:p>
+      <w:pPr>
+        <w:jc w:val="both"/>
+      </w:pPr>
       <w:r>
         <w:t>Key architectural choices and theoretical justifications:</w:t>
       </w:r>
@@ -1818,10 +1910,12 @@
     <w:p>
       <w:pPr>
         <w:pStyle w:val="ListBullet"/>
+        <w:jc w:val="both"/>
       </w:pPr>
       <w:r>
         <w:rPr>
           <w:b/>
+          <w:color w:val="003366"/>
         </w:rPr>
         <w:t xml:space="preserve">PMOS Differential Input Pair (M1, M2): </w:t>
       </w:r>
@@ -1832,10 +1926,12 @@
     <w:p>
       <w:pPr>
         <w:pStyle w:val="ListBullet"/>
+        <w:jc w:val="both"/>
       </w:pPr>
       <w:r>
         <w:rPr>
           <w:b/>
+          <w:color w:val="003366"/>
         </w:rPr>
         <w:t xml:space="preserve">NMOS Active Current Mirror Load (M3, M4): </w:t>
       </w:r>
@@ -1846,10 +1942,12 @@
     <w:p>
       <w:pPr>
         <w:pStyle w:val="ListBullet"/>
+        <w:jc w:val="both"/>
       </w:pPr>
       <w:r>
         <w:rPr>
           <w:b/>
+          <w:color w:val="003366"/>
         </w:rPr>
         <w:t xml:space="preserve">NMOS Common-Source Gain Driver (M6): </w:t>
       </w:r>
@@ -1860,10 +1958,12 @@
     <w:p>
       <w:pPr>
         <w:pStyle w:val="ListBullet"/>
+        <w:jc w:val="both"/>
       </w:pPr>
       <w:r>
         <w:rPr>
           <w:b/>
+          <w:color w:val="003366"/>
         </w:rPr>
         <w:t xml:space="preserve">PMOS Current Source Load (M7): </w:t>
       </w:r>
@@ -1874,10 +1974,12 @@
     <w:p>
       <w:pPr>
         <w:pStyle w:val="ListBullet"/>
+        <w:jc w:val="both"/>
       </w:pPr>
       <w:r>
         <w:rPr>
           <w:b/>
+          <w:color w:val="003366"/>
         </w:rPr>
         <w:t xml:space="preserve">Lead-Lag Miller Compensation (Cc = 3.5 pF, Rz = 3.2 kΩ): </w:t>
       </w:r>
@@ -1894,11 +1996,17 @@
       </w:r>
     </w:p>
     <w:p>
+      <w:pPr>
+        <w:jc w:val="both"/>
+      </w:pPr>
       <w:r>
         <w:t>The design synthesis proceeded from performance targets to device sizing as follows:</w:t>
       </w:r>
     </w:p>
     <w:p>
+      <w:pPr>
+        <w:jc w:val="both"/>
+      </w:pPr>
       <w:r>
         <w:t>1. Compensation Capacitor (Cc) and Slew Rate (SR):</w:t>
         <w:br/>
@@ -1914,6 +2022,9 @@
       </w:r>
     </w:p>
     <w:p>
+      <w:pPr>
+        <w:jc w:val="both"/>
+      </w:pPr>
       <w:r>
         <w:t>2. Input Differential Pair Sizing (M1, M2):</w:t>
         <w:br/>
@@ -1933,6 +2044,9 @@
       </w:r>
     </w:p>
     <w:p>
+      <w:pPr>
+        <w:jc w:val="both"/>
+      </w:pPr>
       <w:r>
         <w:t>3. Second Stage Transconductance (gm6) and Sizing (M6, M7):</w:t>
         <w:br/>
@@ -1948,6 +2062,9 @@
       </w:r>
     </w:p>
     <w:p>
+      <w:pPr>
+        <w:jc w:val="both"/>
+      </w:pPr>
       <w:r>
         <w:t>4. Nulling Resistor (Rz) Derivation for LHP Zero Cancellation:</w:t>
         <w:br/>
@@ -1967,6 +2084,9 @@
       </w:r>
     </w:p>
     <w:p>
+      <w:pPr>
+        <w:jc w:val="both"/>
+      </w:pPr>
       <w:r>
         <w:t>Table 3.1 details the finalized device parameters, aspect ratios, finger allocations, and circuit functions for all components.</w:t>
       </w:r>
@@ -3727,7 +3847,14 @@
       </w:tr>
     </w:tbl>
     <w:p>
+      <w:pPr>
+        <w:jc w:val="center"/>
+      </w:pPr>
       <w:r>
+        <w:rPr>
+          <w:i/>
+          <w:sz w:val="19"/>
+        </w:rPr>
         <w:t>Table 3.1: Finalized Transistor Sizing and Component Specification Table.</w:t>
       </w:r>
     </w:p>
@@ -3753,6 +3880,9 @@
       </w:r>
     </w:p>
     <w:p>
+      <w:pPr>
+        <w:jc w:val="both"/>
+      </w:pPr>
       <w:r>
         <w:t>The operational amplifier was captured hierarchically in Xschem. The subcircuit block `opamp_2stage.sch` defines the 8 transistors, compensation network, and bias resistor, mapped to a standardized 5-pin symbol `opamp_2stage.sym` with pins: `INP`, `INM`, `VOUT`, `VDD`, and `VSS`. The testbench `tb_opamp.sch` instantiates the symbol with ideal power supplies, common-mode source, capacitive load (10 pF), and Middlebrook feedback elements. Figure 4.1 shows the full testbench schematic.</w:t>
       </w:r>
@@ -3766,7 +3896,7 @@
       <w:r>
         <w:drawing>
           <wp:inline xmlns:a="http://schemas.openxmlformats.org/drawingml/2006/main" xmlns:pic="http://schemas.openxmlformats.org/drawingml/2006/picture">
-            <wp:extent cx="5303520" cy="3712464"/>
+            <wp:extent cx="5669280" cy="3588810"/>
             <wp:docPr id="2" name="Picture 2"/>
             <wp:cNvGraphicFramePr>
               <a:graphicFrameLocks noChangeAspect="1"/>
@@ -3775,11 +3905,11 @@
               <a:graphicData uri="http://schemas.openxmlformats.org/drawingml/2006/picture">
                 <pic:pic>
                   <pic:nvPicPr>
-                    <pic:cNvPr id="0" name="opamp_schematic.png"/>
+                    <pic:cNvPr id="0" name="tb_opamp_schematic.png"/>
                     <pic:cNvPicPr/>
                   </pic:nvPicPr>
                   <pic:blipFill>
-                    <a:blip r:embed="rId9"/>
+                    <a:blip r:embed="rId10"/>
                     <a:stretch>
                       <a:fillRect/>
                     </a:stretch>
@@ -3787,7 +3917,7 @@
                   <pic:spPr>
                     <a:xfrm>
                       <a:off x="0" y="0"/>
-                      <a:ext cx="5303520" cy="3712464"/>
+                      <a:ext cx="5669280" cy="3588810"/>
                     </a:xfrm>
                     <a:prstGeom prst="rect"/>
                   </pic:spPr>
@@ -3807,7 +3937,7 @@
           <w:i/>
           <w:sz w:val="19"/>
         </w:rPr>
-        <w:t>Figure 4.1: Comprehensive Testbench Schematic in Xschem (tb_opamp.sch).</w:t>
+        <w:t>Figure 4.1: Comprehensive Testbench Schematic Architecture (tb_opamp.sch).</w:t>
       </w:r>
     </w:p>
     <w:p>
@@ -3819,11 +3949,17 @@
       </w:r>
     </w:p>
     <w:p>
+      <w:pPr>
+        <w:jc w:val="both"/>
+      </w:pPr>
       <w:r>
         <w:t>Simulating high-gain operational amplifiers (Av0 &gt; 70 dB) in open-loop poses a classical SPICE dilemma: microscopic input offsets (&lt; 1 mV) cause the high-gain output node to saturate at either the positive or negative supply rail during the DC operating point calculation, completely corrupting small-signal AC analysis. To solve this, a Middlebrook replica feedback network was incorporated into `tb_opamp.sch`: an ultra-high inductance L_DC = 1.0 TH connects VOUT to INM, while an ultra-high capacitance C_AC = 1.0 TF connects INM to AC ground (VCM = 2.5 V).</w:t>
       </w:r>
     </w:p>
     <w:p>
+      <w:pPr>
+        <w:jc w:val="both"/>
+      </w:pPr>
       <w:r>
         <w:t>At DC (f = 0 Hz), the inductor acts as a dead short (0 Ω) and the capacitor as an open circuit, establishing 100% negative feedback that forces VOUT = INM ≈ 2.5 V, guaranteeing an accurate DC operating point where all 8 transistors remain in deep saturation. At all AC frequencies (f ≥ 1 Hz), the inductor becomes an impenetrable open circuit (Z_L = 2πf × 10¹² Ω) and the capacitor becomes a dead short (Z_C ≈ 0 Ω), perfectly breaking the feedback loop and providing 100% true open-loop small-signal AC gain and phase measurements.</w:t>
       </w:r>
@@ -3837,6 +3973,9 @@
       </w:r>
     </w:p>
     <w:p>
+      <w:pPr>
+        <w:jc w:val="both"/>
+      </w:pPr>
       <w:r>
         <w:t>To ensure 100% repeatability, an automated verification suite consisting of modular Python extractors and Bash wrapper scripts was developed:</w:t>
       </w:r>
@@ -3844,8 +3983,13 @@
     <w:p>
       <w:pPr>
         <w:pStyle w:val="ListBullet"/>
+        <w:jc w:val="both"/>
       </w:pPr>
       <w:r>
+        <w:rPr>
+          <w:b/>
+          <w:color w:val="003366"/>
+        </w:rPr>
         <w:t xml:space="preserve">run_dc.sh (sim_dc.py): </w:t>
       </w:r>
       <w:r>
@@ -3855,8 +3999,13 @@
     <w:p>
       <w:pPr>
         <w:pStyle w:val="ListBullet"/>
+        <w:jc w:val="both"/>
       </w:pPr>
       <w:r>
+        <w:rPr>
+          <w:b/>
+          <w:color w:val="003366"/>
+        </w:rPr>
         <w:t xml:space="preserve">run_ac.sh (sim_ac.py): </w:t>
       </w:r>
       <w:r>
@@ -3866,8 +4015,13 @@
     <w:p>
       <w:pPr>
         <w:pStyle w:val="ListBullet"/>
+        <w:jc w:val="both"/>
       </w:pPr>
       <w:r>
+        <w:rPr>
+          <w:b/>
+          <w:color w:val="003366"/>
+        </w:rPr>
         <w:t xml:space="preserve">run_transient.sh (sim_tran.py): </w:t>
       </w:r>
       <w:r>
@@ -3877,8 +4031,13 @@
     <w:p>
       <w:pPr>
         <w:pStyle w:val="ListBullet"/>
+        <w:jc w:val="both"/>
       </w:pPr>
       <w:r>
+        <w:rPr>
+          <w:b/>
+          <w:color w:val="003366"/>
+        </w:rPr>
         <w:t xml:space="preserve">run_cmrr.sh (sim_cmrr.py): </w:t>
       </w:r>
       <w:r>
@@ -3888,8 +4047,13 @@
     <w:p>
       <w:pPr>
         <w:pStyle w:val="ListBullet"/>
+        <w:jc w:val="both"/>
       </w:pPr>
       <w:r>
+        <w:rPr>
+          <w:b/>
+          <w:color w:val="003366"/>
+        </w:rPr>
         <w:t xml:space="preserve">run_psrr.sh (sim_psrr.py): </w:t>
       </w:r>
       <w:r>
@@ -3899,8 +4063,13 @@
     <w:p>
       <w:pPr>
         <w:pStyle w:val="ListBullet"/>
+        <w:jc w:val="both"/>
       </w:pPr>
       <w:r>
+        <w:rPr>
+          <w:b/>
+          <w:color w:val="003366"/>
+        </w:rPr>
         <w:t xml:space="preserve">run_corners.sh (sim_corners.py): </w:t>
       </w:r>
       <w:r>
@@ -3910,8 +4079,13 @@
     <w:p>
       <w:pPr>
         <w:pStyle w:val="ListBullet"/>
+        <w:jc w:val="both"/>
       </w:pPr>
       <w:r>
+        <w:rPr>
+          <w:b/>
+          <w:color w:val="003366"/>
+        </w:rPr>
         <w:t xml:space="preserve">run_all.sh: </w:t>
       </w:r>
       <w:r>
@@ -3940,6 +4114,9 @@
       </w:r>
     </w:p>
     <w:p>
+      <w:pPr>
+        <w:jc w:val="both"/>
+      </w:pPr>
       <w:r>
         <w:t>A rigorous DC operating point analysis was performed at nominal supply (VDD = 5.0 V, VSS = 0 V) and T = 27°C with common-mode input VCM = 2.50 V. Table 5.1 presents the extracted terminal voltages, drain currents, transconductances, and saturation status for all transistors.</w:t>
       </w:r>
@@ -6018,11 +6195,21 @@
       </w:tr>
     </w:tbl>
     <w:p>
+      <w:pPr>
+        <w:jc w:val="center"/>
+      </w:pPr>
       <w:r>
+        <w:rPr>
+          <w:i/>
+          <w:sz w:val="19"/>
+        </w:rPr>
         <w:t>Table 5.1: Detailed Transistor DC Operating Point Parameters in Saturation.</w:t>
       </w:r>
     </w:p>
     <w:p>
+      <w:pPr>
+        <w:jc w:val="both"/>
+      </w:pPr>
       <w:r>
         <w:t>Critical observations from Table 5.1:</w:t>
         <w:br/>
@@ -6044,6 +6231,9 @@
       </w:r>
     </w:p>
     <w:p>
+      <w:pPr>
+        <w:jc w:val="both"/>
+      </w:pPr>
       <w:r>
         <w:t>The DC open-loop transfer curve was simulated by sweeping differential input voltage from 2.495 V to 2.505 V with 10 µV resolution. Figure 5.1 plots the resulting transfer characteristic and its numerical derivative (open-loop incremental gain).</w:t>
       </w:r>
@@ -6070,7 +6260,7 @@
                     <pic:cNvPicPr/>
                   </pic:nvPicPr>
                   <pic:blipFill>
-                    <a:blip r:embed="rId10"/>
+                    <a:blip r:embed="rId11"/>
                     <a:stretch>
                       <a:fillRect/>
                     </a:stretch>
@@ -6102,6 +6292,9 @@
       </w:r>
     </w:p>
     <w:p>
+      <w:pPr>
+        <w:jc w:val="both"/>
+      </w:pPr>
       <w:r>
         <w:t>The linear output swing—defined where incremental gain exceeds 500 V/V—spans from 0.276 V to 4.617 V. The lower limit is set by Vdsat of NMOS driver M6 (0.258 V), and the upper limit by VDD - |Vdsat7| = 5.0 - 0.429 V = 4.571 V. This wide swing satisfies the 0.5 V to 4.5 V target.</w:t>
       </w:r>
@@ -6115,6 +6308,9 @@
       </w:r>
     </w:p>
     <w:p>
+      <w:pPr>
+        <w:jc w:val="both"/>
+      </w:pPr>
       <w:r>
         <w:t>Figure 5.2 displays the closed-loop voltage follower tracking performance across input voltages from 0.0 V to 5.0 V. Because PMOS inputs are used, the lower common-mode input limit extends all the way down to 0.090 V before M3 and M4 leave saturation. Linear tracking is maintained up to 5.000 V with follower tracking error remaining below 10 mV throughout the targeted 1.0 V to 4.0 V range.</w:t>
       </w:r>
@@ -6141,7 +6337,7 @@
                     <pic:cNvPicPr/>
                   </pic:nvPicPr>
                   <pic:blipFill>
-                    <a:blip r:embed="rId11"/>
+                    <a:blip r:embed="rId12"/>
                     <a:stretch>
                       <a:fillRect/>
                     </a:stretch>
@@ -6181,6 +6377,9 @@
       </w:r>
     </w:p>
     <w:p>
+      <w:pPr>
+        <w:jc w:val="both"/>
+      </w:pPr>
       <w:r>
         <w:t>Figure 5.3 presents the open-loop AC Bode magnitude and phase response from 10 Hz to 100 MHz driving CL = 10 pF.</w:t>
       </w:r>
@@ -6207,7 +6406,7 @@
                     <pic:cNvPicPr/>
                   </pic:nvPicPr>
                   <pic:blipFill>
-                    <a:blip r:embed="rId12"/>
+                    <a:blip r:embed="rId13"/>
                     <a:stretch>
                       <a:fillRect/>
                     </a:stretch>
@@ -6239,6 +6438,9 @@
       </w:r>
     </w:p>
     <w:p>
+      <w:pPr>
+        <w:jc w:val="both"/>
+      </w:pPr>
       <w:r>
         <w:t>Extracted AC Performance Metrics:</w:t>
         <w:br/>
@@ -6266,6 +6468,9 @@
       </w:r>
     </w:p>
     <w:p>
+      <w:pPr>
+        <w:jc w:val="both"/>
+      </w:pPr>
       <w:r>
         <w:t>Transient performance was verified in a unity-gain buffer configuration driving CL = 10 pF. Figure 5.4 displays both the large-signal pulse response (1.0 V to 4.0 V step) and small-signal step settling (2.45 V to 2.55 V step).</w:t>
       </w:r>
@@ -6292,7 +6497,7 @@
                     <pic:cNvPicPr/>
                   </pic:nvPicPr>
                   <pic:blipFill>
-                    <a:blip r:embed="rId13"/>
+                    <a:blip r:embed="rId14"/>
                     <a:stretch>
                       <a:fillRect/>
                     </a:stretch>
@@ -6345,7 +6550,7 @@
                     <pic:cNvPicPr/>
                   </pic:nvPicPr>
                   <pic:blipFill>
-                    <a:blip r:embed="rId14"/>
+                    <a:blip r:embed="rId15"/>
                     <a:stretch>
                       <a:fillRect/>
                     </a:stretch>
@@ -6377,6 +6582,9 @@
       </w:r>
     </w:p>
     <w:p>
+      <w:pPr>
+        <w:jc w:val="both"/>
+      </w:pPr>
       <w:r>
         <w:t>Extracted Transient Metrics:</w:t>
         <w:br/>
@@ -6400,6 +6608,9 @@
       </w:r>
     </w:p>
     <w:p>
+      <w:pPr>
+        <w:jc w:val="both"/>
+      </w:pPr>
       <w:r>
         <w:t>CMRR is defined as 20 log10(|Ad| / |Acm|). Figure 5.5 illustrates CMRR from 10 Hz to 100 MHz. The op-amp achieves a low-frequency CMRR of 72.40 dB, maintaining 72.36 dB at 100 kHz and 69.53 dB at 1 MHz, fully exceeding the 60 dB target.</w:t>
       </w:r>
@@ -6426,7 +6637,7 @@
                     <pic:cNvPicPr/>
                   </pic:nvPicPr>
                   <pic:blipFill>
-                    <a:blip r:embed="rId15"/>
+                    <a:blip r:embed="rId16"/>
                     <a:stretch>
                       <a:fillRect/>
                     </a:stretch>
@@ -6466,6 +6677,9 @@
       </w:r>
     </w:p>
     <w:p>
+      <w:pPr>
+        <w:jc w:val="both"/>
+      </w:pPr>
       <w:r>
         <w:t>PSRR was analyzed by injecting a 1.0 V AC perturbation on the VDD rail (PSRR+) and separately on the VSS rail (PSRR-). Figure 5.6 shows the frequency response of both rejection parameters.</w:t>
       </w:r>
@@ -6492,7 +6706,7 @@
                     <pic:cNvPicPr/>
                   </pic:nvPicPr>
                   <pic:blipFill>
-                    <a:blip r:embed="rId16"/>
+                    <a:blip r:embed="rId17"/>
                     <a:stretch>
                       <a:fillRect/>
                     </a:stretch>
@@ -6524,6 +6738,9 @@
       </w:r>
     </w:p>
     <w:p>
+      <w:pPr>
+        <w:jc w:val="both"/>
+      </w:pPr>
       <w:r>
         <w:t>At DC, PSRR+ reaches an outstanding 99.93 dB and PSRR- reaches 84.87 dB, well exceeding the 60 dB target. PSRR+ remains above 63.8 dB at 100 kHz, providing superb rejection against power supply switching noise.</w:t>
       </w:r>
@@ -6542,6 +6759,9 @@
       </w:r>
     </w:p>
     <w:p>
+      <w:pPr>
+        <w:jc w:val="both"/>
+      </w:pPr>
       <w:r>
         <w:t>To verify that the op-amp will function reliably under manufacturing process spreads and extreme operating temperatures, a 15-point PVT matrix was simulated spanning 5 process corners (NOM, SLOW, FAST, SLOWFAST, FASTSLOW) across -40°C, +27°C, and +125°C. Table 6.1 catalogs all 15 simulated corner outcomes.</w:t>
       </w:r>
@@ -9848,7 +10068,14 @@
       </w:tr>
     </w:tbl>
     <w:p>
+      <w:pPr>
+        <w:jc w:val="center"/>
+      </w:pPr>
       <w:r>
+        <w:rPr>
+          <w:i/>
+          <w:sz w:val="19"/>
+        </w:rPr>
         <w:t>Table 6.1: Comprehensive 15-Point PVT Process Corner and Temperature Simulation Matrix.</w:t>
       </w:r>
     </w:p>
@@ -9874,7 +10101,7 @@
                     <pic:cNvPicPr/>
                   </pic:nvPicPr>
                   <pic:blipFill>
-                    <a:blip r:embed="rId17"/>
+                    <a:blip r:embed="rId18"/>
                     <a:stretch>
                       <a:fillRect/>
                     </a:stretch>
@@ -9906,6 +10133,9 @@
       </w:r>
     </w:p>
     <w:p>
+      <w:pPr>
+        <w:jc w:val="both"/>
+      </w:pPr>
       <w:r>
         <w:t>PVT Performance Summary:</w:t>
         <w:br/>
@@ -9944,6 +10174,7 @@
           <w:p>
             <w:pPr>
               <w:spacing w:before="80" w:after="80"/>
+              <w:jc w:val="both"/>
             </w:pPr>
             <w:r>
               <w:rPr>
@@ -9964,7 +10195,7 @@
     </w:tbl>
     <w:p>
       <w:pPr>
-        <w:spacing w:after="120"/>
+        <w:spacing w:after="80"/>
       </w:pPr>
     </w:p>
     <w:p>
@@ -9989,11 +10220,70 @@
       </w:r>
     </w:p>
     <w:p>
+      <w:pPr>
+        <w:jc w:val="both"/>
+      </w:pPr>
       <w:r>
-        <w:t>The physical layout of the operational amplifier was implemented using a procedural Python layout script (`build_layout.py`) leveraging the KLayout `pya` database API. The total silicon floorplan measures 180.0 µm × 120.0 µm, corresponding to a compact die area of 0.0216 mm² (21,600 µm²).</w:t>
+        <w:t>The physical layout of the operational amplifier was implemented using a procedural Python layout script (`build_layout.py`) leveraging the KLayout `pya` database API. The total silicon floorplan measures 180.0 µm × 120.0 µm, corresponding to a compact die area of 0.0216 mm² (21,600 µm²). Figure 7.1 shows the high-resolution silicon layout generated from the GDSII stream file (`opamp_2stage.gds`).</w:t>
       </w:r>
     </w:p>
     <w:p>
+      <w:pPr>
+        <w:jc w:val="center"/>
+      </w:pPr>
+    </w:p>
+    <w:p>
+      <w:r>
+        <w:drawing>
+          <wp:inline xmlns:a="http://schemas.openxmlformats.org/drawingml/2006/main" xmlns:pic="http://schemas.openxmlformats.org/drawingml/2006/picture">
+            <wp:extent cx="5486400" cy="3657600"/>
+            <wp:docPr id="11" name="Picture 11"/>
+            <wp:cNvGraphicFramePr>
+              <a:graphicFrameLocks noChangeAspect="1"/>
+            </wp:cNvGraphicFramePr>
+            <a:graphic>
+              <a:graphicData uri="http://schemas.openxmlformats.org/drawingml/2006/picture">
+                <pic:pic>
+                  <pic:nvPicPr>
+                    <pic:cNvPr id="0" name="layout_opamp.png"/>
+                    <pic:cNvPicPr/>
+                  </pic:nvPicPr>
+                  <pic:blipFill>
+                    <a:blip r:embed="rId19"/>
+                    <a:stretch>
+                      <a:fillRect/>
+                    </a:stretch>
+                  </pic:blipFill>
+                  <pic:spPr>
+                    <a:xfrm>
+                      <a:off x="0" y="0"/>
+                      <a:ext cx="5486400" cy="3657600"/>
+                    </a:xfrm>
+                    <a:prstGeom prst="rect"/>
+                  </pic:spPr>
+                </pic:pic>
+              </a:graphicData>
+            </a:graphic>
+          </wp:inline>
+        </w:drawing>
+      </w:r>
+    </w:p>
+    <w:p>
+      <w:pPr>
+        <w:jc w:val="center"/>
+      </w:pPr>
+      <w:r>
+        <w:rPr>
+          <w:i/>
+          <w:sz w:val="19"/>
+        </w:rPr>
+        <w:t>Figure 7.1: Synthesized Silicon Layout of the Two-Stage Op-Amp in SCL 1.2 µm (180 µm × 120 µm, KLayout GDSII).</w:t>
+      </w:r>
+    </w:p>
+    <w:p>
+      <w:pPr>
+        <w:jc w:val="both"/>
+      </w:pPr>
       <w:r>
         <w:t>The layout is structured into two horizontal partitions:</w:t>
         <w:br/>
@@ -10013,10 +10303,12 @@
     <w:p>
       <w:pPr>
         <w:pStyle w:val="ListBullet"/>
+        <w:jc w:val="both"/>
       </w:pPr>
       <w:r>
         <w:rPr>
           <w:b/>
+          <w:color w:val="003366"/>
         </w:rPr>
         <w:t xml:space="preserve">Common-Centroid Interdigitation (M1, M2): </w:t>
       </w:r>
@@ -10027,10 +10319,12 @@
     <w:p>
       <w:pPr>
         <w:pStyle w:val="ListBullet"/>
+        <w:jc w:val="both"/>
       </w:pPr>
       <w:r>
         <w:rPr>
           <w:b/>
+          <w:color w:val="003366"/>
         </w:rPr>
         <w:t xml:space="preserve">Current Mirror Matching (M3/M4 and M5/M7/M8): </w:t>
       </w:r>
@@ -10041,10 +10335,12 @@
     <w:p>
       <w:pPr>
         <w:pStyle w:val="ListBullet"/>
+        <w:jc w:val="both"/>
       </w:pPr>
       <w:r>
         <w:rPr>
           <w:b/>
+          <w:color w:val="003366"/>
         </w:rPr>
         <w:t xml:space="preserve">Low-Impedance Power Routing: </w:t>
       </w:r>
@@ -10061,6 +10357,9 @@
       </w:r>
     </w:p>
     <w:p>
+      <w:pPr>
+        <w:jc w:val="both"/>
+      </w:pPr>
       <w:r>
         <w:t>The synthesized GDSII layout (`opamp_2stage.gds`) was subjected to automated Design Rule Checking using the official SCL rule deck `c1d_drc.drc` inside KLayout. The run report was saved to `layout/scl_drc.txt`. The procedural script established the correct structural placements; identified DRC violations were related to active diffusion-to-well tap spacings (rules 1.3.2, 1.3.3: min 3.5 µm) and contact enclosure margins. The generated layout represents an initial structural placement requiring interactive graphical touch-up prior to tapeout.</w:t>
       </w:r>
@@ -10074,11 +10373,17 @@
       </w:r>
     </w:p>
     <w:p>
+      <w:pPr>
+        <w:jc w:val="both"/>
+      </w:pPr>
       <w:r>
         <w:t>A rigorous audit of the SCL 1.2 µm open-source PDK extraction tools was performed. The findings are documented with total transparency:</w:t>
       </w:r>
     </w:p>
     <w:p>
+      <w:pPr>
+        <w:jc w:val="both"/>
+      </w:pPr>
       <w:r>
         <w:t>1. LVS Deck Limitations: The official SCL LVS deck (`lvs_os_scl_c1d.lvs`) recognizes only 10 legal primitive devices: NMOS, PMOS, 5 resistor types, and 3 junction diodes. There is NO capacitor extraction rule. Because the op-amp netlist requires a 3.5 pF Miller capacitor, the standard LVS deck cannot extract or match the capacitor from layout.</w:t>
         <w:br/>
@@ -10101,6 +10406,9 @@
       </w:r>
     </w:p>
     <w:p>
+      <w:pPr>
+        <w:jc w:val="both"/>
+      </w:pPr>
       <w:r>
         <w:t>A high-gain, wideband, power-efficient two-stage CMOS operational amplifier has been successfully designed, characterized, and verified in the SCL 1.2 µm CMOS process using an end-to-end open-source EDA flow. Table 8.1 presents the final comparison between target specifications and verified simulation results.</w:t>
       </w:r>
@@ -11533,11 +11841,21 @@
       </w:tr>
     </w:tbl>
     <w:p>
+      <w:pPr>
+        <w:jc w:val="center"/>
+      </w:pPr>
       <w:r>
+        <w:rPr>
+          <w:i/>
+          <w:sz w:val="19"/>
+        </w:rPr>
         <w:t>Table 8.1: Final Project Performance and Compliance Matrix.</w:t>
       </w:r>
     </w:p>
     <w:p>
+      <w:pPr>
+        <w:jc w:val="both"/>
+      </w:pPr>
       <w:r>
         <w:t>Key Accomplishments:</w:t>
         <w:br/>
@@ -11559,6 +11877,9 @@
       </w:r>
     </w:p>
     <w:p>
+      <w:pPr>
+        <w:jc w:val="both"/>
+      </w:pPr>
       <w:r>
         <w:t>1. B. Razavi, Design of Analog CMOS Integrated Circuits, 2nd ed. McGraw-Hill, 2017.</w:t>
         <w:br/>
@@ -11948,10 +12269,11 @@
     <w:rsid w:val="00FC693F"/>
     <w:pPr>
       <w:spacing w:line="276" w:lineRule="auto" w:after="120"/>
+      <w:jc w:val="both"/>
     </w:pPr>
     <w:rPr>
       <w:rFonts w:ascii="Calibri" w:hAnsi="Calibri"/>
-      <w:color w:val="333333"/>
+      <w:color w:val="282828"/>
       <w:sz w:val="22"/>
     </w:rPr>
   </w:style>

</xml_diff>